<commit_message>
Spell the surname "Tapiero" everywhere
I had settled on "Tapiro" from the READMEs and the personal email
address. That was the wrong half: app/web/index.html and the poster
both already read "Tapiero", and it is the correct spelling.

Reversed across all five places that carry it — the three READMEs, the
executive summary, and slides 1 and 2 of the deck, which previously
disagreed with each other.
</commit_message>
<xml_diff>
--- a/documentation/submissions/business/Executive Summary Accessible Academic.docx
+++ b/documentation/submissions/business/Executive Summary Accessible Academic.docx
@@ -207,7 +207,7 @@
                 <w:sz w:val="20"/>
                 <w:szCs w:val="20"/>
               </w:rPr>
-              <w:t xml:space="preserve">Adi Tapiro · Matan Gurfinkel</w:t>
+              <w:t xml:space="preserve">Adi Tapiero · Matan Gurfinkel</w:t>
             </w:r>
           </w:p>
         </w:tc>
@@ -930,7 +930,7 @@
           <w:sz w:val="22"/>
           <w:szCs w:val="22"/>
         </w:rPr>
-        <w:t xml:space="preserve">Adi Tapiro, one of the two founders, is a hearing-impaired computer science student.</w:t>
+        <w:t xml:space="preserve">Adi Tapiero, one of the two founders, is a hearing-impaired computer science student.</w:t>
       </w:r>
     </w:p>
     <w:p>
@@ -2909,7 +2909,7 @@
                 <w:sz w:val="20"/>
                 <w:szCs w:val="20"/>
               </w:rPr>
-              <w:t xml:space="preserve">Adi Tapiro</w:t>
+              <w:t xml:space="preserve">Adi Tapiero</w:t>
             </w:r>
           </w:p>
         </w:tc>

</xml_diff>